<commit_message>
Make the repository self-contained and layout-correct
- add build_ch4_tables.py: the six Chapter 4 intermediate tables that every
  figure and appendix script reads are now derived from results/ rather than
  produced by an out-of-repo script; verified value-identical to the originals
- add a local forecasting stage to run_local.py, so the whole pipeline runs
  without a Modal account
- correct path offsets: the repository drops the submission_final/ level
- add README.md, TECHNICAL_APPENDIX.md/.docx, LICENSE, .gitignore
</commit_message>
<xml_diff>
--- a/TECHNICAL_APPENDIX.docx
+++ b/TECHNICAL_APPENDIX.docx
@@ -398,6 +398,75 @@
               <w:rPr>
                 <w:rStyle w:val="VerbatimChar"/>
               </w:rPr>
+              <w:t xml:space="preserve">ch4_tables/</w:t>
+            </w:r>
+          </w:p>
+        </w:tc>
+        <w:tc>
+          <w:tcPr/>
+          <w:p>
+            <w:pPr>
+              <w:pStyle w:val="Compact"/>
+            </w:pPr>
+            <w:r>
+              <w:t xml:space="preserve">Six intermediate tables derived from</w:t>
+            </w:r>
+            <w:r>
+              <w:t xml:space="preserve"> </w:t>
+            </w:r>
+            <w:r>
+              <w:rPr>
+                <w:rStyle w:val="VerbatimChar"/>
+              </w:rPr>
+              <w:t xml:space="preserve">results/</w:t>
+            </w:r>
+            <w:r>
+              <w:t xml:space="preserve"> </w:t>
+            </w:r>
+            <w:r>
+              <w:t xml:space="preserve">by</w:t>
+            </w:r>
+            <w:r>
+              <w:t xml:space="preserve"> </w:t>
+            </w:r>
+            <w:r>
+              <w:rPr>
+                <w:rStyle w:val="VerbatimChar"/>
+              </w:rPr>
+              <w:t xml:space="preserve">build_ch4_tables.py</w:t>
+            </w:r>
+            <w:r>
+              <w:t xml:space="preserve">; every figure and appendix script reads these rather than</w:t>
+            </w:r>
+            <w:r>
+              <w:t xml:space="preserve"> </w:t>
+            </w:r>
+            <w:r>
+              <w:rPr>
+                <w:rStyle w:val="VerbatimChar"/>
+              </w:rPr>
+              <w:t xml:space="preserve">results/</w:t>
+            </w:r>
+            <w:r>
+              <w:t xml:space="preserve"> </w:t>
+            </w:r>
+            <w:r>
+              <w:t xml:space="preserve">directly</w:t>
+            </w:r>
+          </w:p>
+        </w:tc>
+      </w:tr>
+      <w:tr>
+        <w:tc>
+          <w:tcPr/>
+          <w:p>
+            <w:pPr>
+              <w:pStyle w:val="Compact"/>
+            </w:pPr>
+            <w:r>
+              <w:rPr>
+                <w:rStyle w:val="VerbatimChar"/>
+              </w:rPr>
               <w:t xml:space="preserve">lake_pkls/</w:t>
             </w:r>
           </w:p>
@@ -1632,6 +1701,18 @@
             <w:pPr>
               <w:pStyle w:val="Compact"/>
             </w:pPr>
+            <w:r>
+              <w:rPr>
+                <w:rStyle w:val="VerbatimChar"/>
+              </w:rPr>
+              <w:t xml:space="preserve">ch4_tables/</w:t>
+            </w:r>
+            <w:r>
+              <w:t xml:space="preserve">,</w:t>
+            </w:r>
+            <w:r>
+              <w:t xml:space="preserve"> </w:t>
+            </w:r>
             <w:r>
               <w:rPr>
                 <w:rStyle w:val="VerbatimChar"/>

</xml_diff>

<commit_message>
Document the measured reproduction tolerance instead of claiming exactness
A local rerun of the forecasting stage shows Persistence exact, SARIMA(X)
to 1e-5 and AR-only XGBoost to 7e-5, but XGBoost with exogenous predictors
differing by up to 8e-3 -- xgboost was never version-pinned and its missing
value handling has changed across major versions.
</commit_message>
<xml_diff>
--- a/TECHNICAL_APPENDIX.docx
+++ b/TECHNICAL_APPENDIX.docx
@@ -1326,13 +1326,272 @@
         <w:pStyle w:val="BodyText"/>
       </w:pPr>
       <w:r>
-        <w:t xml:space="preserve">Surrogate generation and XGBoost both use fixed seeds, so a rerun on the same</w:t>
-      </w:r>
-      <w:r>
-        <w:t xml:space="preserve"> </w:t>
-      </w:r>
-      <w:r>
-        <w:t xml:space="preserve">inputs reproduces the reported numbers exactly.</w:t>
+        <w:rPr>
+          <w:b/>
+          <w:bCs/>
+        </w:rPr>
+        <w:t xml:space="preserve">Reproduction tolerance.</w:t>
+      </w:r>
+    </w:p>
+    <w:p>
+      <w:pPr>
+        <w:pStyle w:val="BodyText"/>
+      </w:pPr>
+      <w:r>
+        <w:t xml:space="preserve">Surrogate generation uses fixed seeds, so the CCM stages are deterministic and</w:t>
+      </w:r>
+      <w:r>
+        <w:t xml:space="preserve"> </w:t>
+      </w:r>
+      <w:r>
+        <w:t xml:space="preserve">reproduce exactly. The forecasting stage does not reproduce to the last decimal</w:t>
+      </w:r>
+      <w:r>
+        <w:t xml:space="preserve"> </w:t>
+      </w:r>
+      <w:r>
+        <w:t xml:space="preserve">on a different platform. Rerunning Kalamalka at a one-month horizon on macOS /</w:t>
+      </w:r>
+      <w:r>
+        <w:t xml:space="preserve"> </w:t>
+      </w:r>
+      <w:r>
+        <w:t xml:space="preserve">arm64 with</w:t>
+      </w:r>
+      <w:r>
+        <w:t xml:space="preserve"> </w:t>
+      </w:r>
+      <w:r>
+        <w:rPr>
+          <w:rStyle w:val="VerbatimChar"/>
+        </w:rPr>
+        <w:t xml:space="preserve">xgboost</w:t>
+      </w:r>
+      <w:r>
+        <w:t xml:space="preserve"> </w:t>
+      </w:r>
+      <w:r>
+        <w:t xml:space="preserve">3.4.1, against the published results produced on Modal’s</w:t>
+      </w:r>
+      <w:r>
+        <w:t xml:space="preserve"> </w:t>
+      </w:r>
+      <w:r>
+        <w:t xml:space="preserve">Linux containers, gives:</w:t>
+      </w:r>
+    </w:p>
+    <w:tbl>
+      <w:tblPr>
+        <w:tblStyle w:val="Table"/>
+        <w:tblW w:type="auto" w:w="0"/>
+        <w:tblLook w:firstRow="1" w:lastRow="0" w:firstColumn="0" w:lastColumn="0" w:noHBand="0" w:noVBand="0" w:val="0020"/>
+      </w:tblPr>
+      <w:tblGrid>
+        <w:gridCol w:w="3960"/>
+        <w:gridCol w:w="3960"/>
+      </w:tblGrid>
+      <w:tr>
+        <w:trPr>
+          <w:tblHeader w:val="on"/>
+        </w:trPr>
+        <w:tc>
+          <w:tcPr/>
+          <w:p>
+            <w:pPr>
+              <w:pStyle w:val="Compact"/>
+            </w:pPr>
+            <w:r>
+              <w:t xml:space="preserve">Method family</w:t>
+            </w:r>
+          </w:p>
+        </w:tc>
+        <w:tc>
+          <w:tcPr/>
+          <w:p>
+            <w:pPr>
+              <w:pStyle w:val="Compact"/>
+            </w:pPr>
+            <w:r>
+              <w:t xml:space="preserve">Largest absolute RMSE difference</w:t>
+            </w:r>
+          </w:p>
+        </w:tc>
+      </w:tr>
+      <w:tr>
+        <w:tc>
+          <w:tcPr/>
+          <w:p>
+            <w:pPr>
+              <w:pStyle w:val="Compact"/>
+            </w:pPr>
+            <w:r>
+              <w:t xml:space="preserve">Persistence</w:t>
+            </w:r>
+          </w:p>
+        </w:tc>
+        <w:tc>
+          <w:tcPr/>
+          <w:p>
+            <w:pPr>
+              <w:pStyle w:val="Compact"/>
+            </w:pPr>
+            <w:r>
+              <w:t xml:space="preserve">0 (exact)</w:t>
+            </w:r>
+          </w:p>
+        </w:tc>
+      </w:tr>
+      <w:tr>
+        <w:tc>
+          <w:tcPr/>
+          <w:p>
+            <w:pPr>
+              <w:pStyle w:val="Compact"/>
+            </w:pPr>
+            <w:r>
+              <w:t xml:space="preserve">SARIMA, SARIMAX (all five variable sets)</w:t>
+            </w:r>
+          </w:p>
+        </w:tc>
+        <w:tc>
+          <w:tcPr/>
+          <w:p>
+            <w:pPr>
+              <w:pStyle w:val="Compact"/>
+            </w:pPr>
+            <w:r>
+              <w:t xml:space="preserve">1.0 x 10^-5</w:t>
+            </w:r>
+          </w:p>
+        </w:tc>
+      </w:tr>
+      <w:tr>
+        <w:tc>
+          <w:tcPr/>
+          <w:p>
+            <w:pPr>
+              <w:pStyle w:val="Compact"/>
+            </w:pPr>
+            <w:r>
+              <w:t xml:space="preserve">XGBoost, autoregressive features only</w:t>
+            </w:r>
+          </w:p>
+        </w:tc>
+        <w:tc>
+          <w:tcPr/>
+          <w:p>
+            <w:pPr>
+              <w:pStyle w:val="Compact"/>
+            </w:pPr>
+            <w:r>
+              <w:t xml:space="preserve">6.7 x 10^-5</w:t>
+            </w:r>
+          </w:p>
+        </w:tc>
+      </w:tr>
+      <w:tr>
+        <w:tc>
+          <w:tcPr/>
+          <w:p>
+            <w:pPr>
+              <w:pStyle w:val="Compact"/>
+            </w:pPr>
+            <w:r>
+              <w:t xml:space="preserve">XGBoost with exogenous predictors</w:t>
+            </w:r>
+          </w:p>
+        </w:tc>
+        <w:tc>
+          <w:tcPr/>
+          <w:p>
+            <w:pPr>
+              <w:pStyle w:val="Compact"/>
+            </w:pPr>
+            <w:r>
+              <w:t xml:space="preserve">7.8 x 10^-3</w:t>
+            </w:r>
+          </w:p>
+        </w:tc>
+      </w:tr>
+    </w:tbl>
+    <w:p>
+      <w:pPr>
+        <w:pStyle w:val="BodyText"/>
+      </w:pPr>
+      <w:r>
+        <w:t xml:space="preserve">The first three rows are optimiser and floating-point noise. The last row is</w:t>
+      </w:r>
+      <w:r>
+        <w:t xml:space="preserve"> </w:t>
+      </w:r>
+      <w:r>
+        <w:t xml:space="preserve">larger because</w:t>
+      </w:r>
+      <w:r>
+        <w:t xml:space="preserve"> </w:t>
+      </w:r>
+      <w:r>
+        <w:rPr>
+          <w:rStyle w:val="VerbatimChar"/>
+        </w:rPr>
+        <w:t xml:space="preserve">xgboost</w:t>
+      </w:r>
+      <w:r>
+        <w:t xml:space="preserve"> </w:t>
+      </w:r>
+      <w:r>
+        <w:t xml:space="preserve">was not version-pinned in the original run and its</w:t>
+      </w:r>
+      <w:r>
+        <w:t xml:space="preserve"> </w:t>
+      </w:r>
+      <w:r>
+        <w:t xml:space="preserve">handling of missing values in exogenous columns has changed across major</w:t>
+      </w:r>
+      <w:r>
+        <w:t xml:space="preserve"> </w:t>
+      </w:r>
+      <w:r>
+        <w:t xml:space="preserve">versions; no record of the version used survives, so it cannot be pinned here</w:t>
+      </w:r>
+      <w:r>
+        <w:t xml:space="preserve"> </w:t>
+      </w:r>
+      <w:r>
+        <w:t xml:space="preserve">retrospectively. A difference of this size can reorder two closely spaced</w:t>
+      </w:r>
+      <w:r>
+        <w:t xml:space="preserve"> </w:t>
+      </w:r>
+      <w:r>
+        <w:t xml:space="preserve">XGBoost variants within a single lake and horizon, so treat the per-cell</w:t>
+      </w:r>
+      <w:r>
+        <w:t xml:space="preserve"> </w:t>
+      </w:r>
+      <w:r>
+        <w:t xml:space="preserve">forecasting numbers as reproducible to about three decimal places rather than</w:t>
+      </w:r>
+      <w:r>
+        <w:t xml:space="preserve"> </w:t>
+      </w:r>
+      <w:r>
+        <w:t xml:space="preserve">exactly. Pin</w:t>
+      </w:r>
+      <w:r>
+        <w:t xml:space="preserve"> </w:t>
+      </w:r>
+      <w:r>
+        <w:rPr>
+          <w:rStyle w:val="VerbatimChar"/>
+        </w:rPr>
+        <w:t xml:space="preserve">xgboost</w:t>
+      </w:r>
+      <w:r>
+        <w:t xml:space="preserve"> </w:t>
+      </w:r>
+      <w:r>
+        <w:t xml:space="preserve">yourself if you need bitwise agreement across machines.</w:t>
       </w:r>
     </w:p>
     <w:p>

</xml_diff>

<commit_message>
Add verify.py and fix the table build order it exposed
A clean-room clone showed build_appendices.py running before
table_C1_supported_drivers.py, which writes the TC1 table it reads: the
alphabetical ordering in stage_figures only worked because the output was
already committed. Both run_local.py and verify.py now use the explicit
dependency order.

verify.py regenerates every derived table, dataset file and figure in a
scratch copy and compares them byte for byte, then recomputes one CCM edge
at 3 surrogates instead of 500 (rho and the optimal lag do not depend on the
surrogate count, so the comparison against the published value stays exact).

Also corrects the README's untested claim of Python 3.10-3.12 support and
notes that 3.13+ cannot work with numpy 1.26.4.
</commit_message>
<xml_diff>
--- a/TECHNICAL_APPENDIX.docx
+++ b/TECHNICAL_APPENDIX.docx
@@ -603,6 +603,33 @@
           </w:p>
         </w:tc>
       </w:tr>
+      <w:tr>
+        <w:tc>
+          <w:tcPr/>
+          <w:p>
+            <w:pPr>
+              <w:pStyle w:val="Compact"/>
+            </w:pPr>
+            <w:r>
+              <w:rPr>
+                <w:rStyle w:val="VerbatimChar"/>
+              </w:rPr>
+              <w:t xml:space="preserve">verify.py</w:t>
+            </w:r>
+          </w:p>
+        </w:tc>
+        <w:tc>
+          <w:tcPr/>
+          <w:p>
+            <w:pPr>
+              <w:pStyle w:val="Compact"/>
+            </w:pPr>
+            <w:r>
+              <w:t xml:space="preserve">Four-minute check: regenerates every derived table, dataset file and figure and compares them byte for byte, then recomputes one CCM edge</w:t>
+            </w:r>
+          </w:p>
+        </w:tc>
+      </w:tr>
     </w:tbl>
     <w:p>
       <w:pPr>
@@ -955,7 +982,28 @@
         <w:pStyle w:val="FirstParagraph"/>
       </w:pPr>
       <w:r>
-        <w:t xml:space="preserve">Python 3.12 (3.10–3.12 all tested).</w:t>
+        <w:t xml:space="preserve">Python 3.12, the version every result here was produced on and the only one</w:t>
+      </w:r>
+      <w:r>
+        <w:t xml:space="preserve"> </w:t>
+      </w:r>
+      <w:r>
+        <w:t xml:space="preserve">this repository has been tested against. 3.13 and later will not work, because</w:t>
+      </w:r>
+      <w:r>
+        <w:t xml:space="preserve"> </w:t>
+      </w:r>
+      <w:r>
+        <w:rPr>
+          <w:rStyle w:val="VerbatimChar"/>
+        </w:rPr>
+        <w:t xml:space="preserve">numpy==1.26.4</w:t>
+      </w:r>
+      <w:r>
+        <w:t xml:space="preserve"> </w:t>
+      </w:r>
+      <w:r>
+        <w:t xml:space="preserve">has no wheels for them.</w:t>
       </w:r>
     </w:p>
     <w:p>

</xml_diff>